<commit_message>
Changes to AudioViz Documentation
</commit_message>
<xml_diff>
--- a/docs/AudioViz Documentation.docx
+++ b/docs/AudioViz Documentation.docx
@@ -916,10 +916,209 @@
           </w:tcPr>
           <w:p>
             <w:r>
-              <w:rPr>
-                <w:color w:val="EE0000"/>
-              </w:rPr>
-              <w:t>Include connection setup information. Whatever else needs to go here</w:t>
+              <w:t>Hardware required</w:t>
+            </w:r>
+          </w:p>
+          <w:p>
+            <w:pPr>
+              <w:pStyle w:val="ListParagraph"/>
+              <w:numPr>
+                <w:ilvl w:val="0"/>
+                <w:numId w:val="11"/>
+              </w:numPr>
+            </w:pPr>
+            <w:r>
+              <w:t xml:space="preserve">Arduino Uno </w:t>
+            </w:r>
+          </w:p>
+          <w:p>
+            <w:pPr>
+              <w:pStyle w:val="ListParagraph"/>
+              <w:numPr>
+                <w:ilvl w:val="0"/>
+                <w:numId w:val="11"/>
+              </w:numPr>
+            </w:pPr>
+            <w:proofErr w:type="gramStart"/>
+            <w:r>
+              <w:t>16×16</w:t>
+            </w:r>
+            <w:proofErr w:type="gramEnd"/>
+            <w:r>
+              <w:t xml:space="preserve"> WS2812B LED matrix </w:t>
+            </w:r>
+          </w:p>
+          <w:p>
+            <w:pPr>
+              <w:pStyle w:val="ListParagraph"/>
+              <w:numPr>
+                <w:ilvl w:val="0"/>
+                <w:numId w:val="11"/>
+              </w:numPr>
+            </w:pPr>
+            <w:r>
+              <w:t>USB cable (USB-A to USB-B for Arduino Uno)</w:t>
+            </w:r>
+          </w:p>
+          <w:p>
+            <w:r>
+              <w:t>Wiring Instructions</w:t>
+            </w:r>
+          </w:p>
+          <w:p>
+            <w:pPr>
+              <w:pStyle w:val="ListParagraph"/>
+              <w:numPr>
+                <w:ilvl w:val="0"/>
+                <w:numId w:val="12"/>
+              </w:numPr>
+            </w:pPr>
+            <w:r>
+              <w:t xml:space="preserve">Connect the </w:t>
+            </w:r>
+            <w:r>
+              <w:rPr>
+                <w:b/>
+                <w:bCs/>
+              </w:rPr>
+              <w:t>VCC</w:t>
+            </w:r>
+            <w:r>
+              <w:t xml:space="preserve"> pin on the LED matrix to the </w:t>
+            </w:r>
+            <w:r>
+              <w:rPr>
+                <w:b/>
+                <w:bCs/>
+              </w:rPr>
+              <w:t>5V</w:t>
+            </w:r>
+            <w:r>
+              <w:t xml:space="preserve"> </w:t>
+            </w:r>
+            <w:r>
+              <w:t>from power supply</w:t>
+            </w:r>
+          </w:p>
+          <w:p>
+            <w:pPr>
+              <w:pStyle w:val="ListParagraph"/>
+              <w:numPr>
+                <w:ilvl w:val="0"/>
+                <w:numId w:val="12"/>
+              </w:numPr>
+            </w:pPr>
+            <w:r>
+              <w:t xml:space="preserve">Connect the </w:t>
+            </w:r>
+            <w:r>
+              <w:rPr>
+                <w:b/>
+                <w:bCs/>
+              </w:rPr>
+              <w:t>GND</w:t>
+            </w:r>
+            <w:r>
+              <w:t xml:space="preserve"> pin on the LED matrix to the </w:t>
+            </w:r>
+            <w:r>
+              <w:rPr>
+                <w:b/>
+                <w:bCs/>
+              </w:rPr>
+              <w:t>GND</w:t>
+            </w:r>
+            <w:r>
+              <w:t xml:space="preserve"> pin on the Arduino</w:t>
+            </w:r>
+          </w:p>
+          <w:p>
+            <w:pPr>
+              <w:pStyle w:val="ListParagraph"/>
+              <w:numPr>
+                <w:ilvl w:val="0"/>
+                <w:numId w:val="12"/>
+              </w:numPr>
+            </w:pPr>
+            <w:r>
+              <w:t xml:space="preserve">Connect the </w:t>
+            </w:r>
+            <w:r>
+              <w:rPr>
+                <w:b/>
+                <w:bCs/>
+              </w:rPr>
+              <w:t>DATA IN</w:t>
+            </w:r>
+            <w:r>
+              <w:t xml:space="preserve"> pin of the LED matrix to </w:t>
+            </w:r>
+            <w:r>
+              <w:rPr>
+                <w:b/>
+                <w:bCs/>
+              </w:rPr>
+              <w:t>digital pin 6</w:t>
+            </w:r>
+            <w:r>
+              <w:t xml:space="preserve"> on the Arduino</w:t>
+            </w:r>
+          </w:p>
+          <w:p>
+            <w:r>
+              <w:t>USB Connection</w:t>
+            </w:r>
+          </w:p>
+          <w:p>
+            <w:pPr>
+              <w:pStyle w:val="ListParagraph"/>
+              <w:numPr>
+                <w:ilvl w:val="0"/>
+                <w:numId w:val="13"/>
+              </w:numPr>
+            </w:pPr>
+            <w:r>
+              <w:t>Plug the Arduino into your computer using the USB cable</w:t>
+            </w:r>
+          </w:p>
+          <w:p>
+            <w:pPr>
+              <w:pStyle w:val="ListParagraph"/>
+              <w:numPr>
+                <w:ilvl w:val="0"/>
+                <w:numId w:val="13"/>
+              </w:numPr>
+            </w:pPr>
+            <w:r>
+              <w:t xml:space="preserve">Inside the </w:t>
+            </w:r>
+            <w:proofErr w:type="spellStart"/>
+            <w:r>
+              <w:t>AudioViz</w:t>
+            </w:r>
+            <w:proofErr w:type="spellEnd"/>
+            <w:r>
+              <w:t xml:space="preserve"> app, go to the </w:t>
+            </w:r>
+            <w:r>
+              <w:rPr>
+                <w:b/>
+                <w:bCs/>
+              </w:rPr>
+              <w:t>Audio Input menu</w:t>
+            </w:r>
+            <w:r>
+              <w:t xml:space="preserve"> → </w:t>
+            </w:r>
+            <w:r>
+              <w:rPr>
+                <w:b/>
+                <w:bCs/>
+              </w:rPr>
+              <w:t>USB Port tab</w:t>
+            </w:r>
+            <w:r>
+              <w:t>, and select the correct COM port for your Arduino.</w:t>
             </w:r>
           </w:p>
         </w:tc>
@@ -957,30 +1156,213 @@
           <w:p>
             <w:pPr>
               <w:rPr>
-                <w:color w:val="EE0000"/>
+                <w:rStyle w:val="Tryit"/>
               </w:rPr>
             </w:pPr>
             <w:r>
               <w:rPr>
                 <w:rStyle w:val="Tryit"/>
-                <w:color w:val="EE0000"/>
-              </w:rPr>
-              <w:t>Try it</w:t>
-            </w:r>
-            <w:r>
-              <w:rPr>
-                <w:color w:val="EE0000"/>
-              </w:rPr>
-              <w:t xml:space="preserve">: </w:t>
-            </w:r>
-            <w:r>
-              <w:rPr>
-                <w:color w:val="EE0000"/>
-              </w:rPr>
-              <w:t>Stuff</w:t>
-            </w:r>
-          </w:p>
-          <w:p/>
+              </w:rPr>
+              <w:t xml:space="preserve">Try it: </w:t>
+            </w:r>
+          </w:p>
+          <w:p>
+            <w:pPr>
+              <w:pStyle w:val="ListParagraph"/>
+              <w:numPr>
+                <w:ilvl w:val="0"/>
+                <w:numId w:val="14"/>
+              </w:numPr>
+            </w:pPr>
+            <w:r>
+              <w:t xml:space="preserve">Open the </w:t>
+            </w:r>
+            <w:proofErr w:type="spellStart"/>
+            <w:r>
+              <w:t>AudioViz</w:t>
+            </w:r>
+            <w:proofErr w:type="spellEnd"/>
+            <w:r>
+              <w:t xml:space="preserve"> Application</w:t>
+            </w:r>
+          </w:p>
+          <w:p>
+            <w:pPr>
+              <w:pStyle w:val="ListParagraph"/>
+              <w:numPr>
+                <w:ilvl w:val="1"/>
+                <w:numId w:val="14"/>
+              </w:numPr>
+            </w:pPr>
+            <w:r>
+              <w:t>Launch the app and ensure it detects your Arduino. Go to the Audio Input menu, then the USB Port tab, and select the correct port</w:t>
+            </w:r>
+          </w:p>
+          <w:p>
+            <w:pPr>
+              <w:pStyle w:val="ListParagraph"/>
+              <w:numPr>
+                <w:ilvl w:val="0"/>
+                <w:numId w:val="14"/>
+              </w:numPr>
+            </w:pPr>
+            <w:r>
+              <w:t>Select an Audio Input</w:t>
+            </w:r>
+          </w:p>
+          <w:p>
+            <w:pPr>
+              <w:pStyle w:val="ListParagraph"/>
+              <w:numPr>
+                <w:ilvl w:val="1"/>
+                <w:numId w:val="14"/>
+              </w:numPr>
+            </w:pPr>
+            <w:r>
+              <w:t xml:space="preserve">In the </w:t>
+            </w:r>
+            <w:r>
+              <w:rPr>
+                <w:b/>
+                <w:bCs/>
+              </w:rPr>
+              <w:t>Audio Input menu</w:t>
+            </w:r>
+            <w:r>
+              <w:t xml:space="preserve">, switch to the </w:t>
+            </w:r>
+            <w:r>
+              <w:rPr>
+                <w:b/>
+                <w:bCs/>
+              </w:rPr>
+              <w:t>Audio Device tab</w:t>
+            </w:r>
+            <w:r>
+              <w:t xml:space="preserve"> and choose your microphone or desired input source</w:t>
+            </w:r>
+          </w:p>
+          <w:p>
+            <w:pPr>
+              <w:pStyle w:val="ListParagraph"/>
+              <w:numPr>
+                <w:ilvl w:val="0"/>
+                <w:numId w:val="14"/>
+              </w:numPr>
+            </w:pPr>
+            <w:r>
+              <w:t>Start the Visualization</w:t>
+            </w:r>
+          </w:p>
+          <w:p>
+            <w:pPr>
+              <w:pStyle w:val="ListParagraph"/>
+              <w:numPr>
+                <w:ilvl w:val="1"/>
+                <w:numId w:val="14"/>
+              </w:numPr>
+            </w:pPr>
+            <w:r>
+              <w:t xml:space="preserve">In the </w:t>
+            </w:r>
+            <w:r>
+              <w:rPr>
+                <w:b/>
+                <w:bCs/>
+              </w:rPr>
+              <w:t>Display Control Menu</w:t>
+            </w:r>
+            <w:r>
+              <w:t xml:space="preserve">, press the </w:t>
+            </w:r>
+            <w:r>
+              <w:rPr>
+                <w:b/>
+                <w:bCs/>
+              </w:rPr>
+              <w:t>Start</w:t>
+            </w:r>
+            <w:r>
+              <w:t xml:space="preserve"> button. Speak into your microphone </w:t>
+            </w:r>
+          </w:p>
+          <w:p>
+            <w:pPr>
+              <w:pStyle w:val="ListParagraph"/>
+              <w:numPr>
+                <w:ilvl w:val="0"/>
+                <w:numId w:val="14"/>
+              </w:numPr>
+            </w:pPr>
+            <w:r>
+              <w:t>Watch the LEDs React</w:t>
+            </w:r>
+          </w:p>
+          <w:p>
+            <w:pPr>
+              <w:pStyle w:val="ListParagraph"/>
+              <w:numPr>
+                <w:ilvl w:val="1"/>
+                <w:numId w:val="14"/>
+              </w:numPr>
+            </w:pPr>
+            <w:r>
+              <w:t xml:space="preserve">If everything is set up correctly, your LED grid should now light up in columns and rows </w:t>
+            </w:r>
+            <w:proofErr w:type="gramStart"/>
+            <w:r>
+              <w:t xml:space="preserve">based </w:t>
+            </w:r>
+            <w:proofErr w:type="spellStart"/>
+            <w:r>
+              <w:t>if</w:t>
+            </w:r>
+            <w:proofErr w:type="spellEnd"/>
+            <w:proofErr w:type="gramEnd"/>
+            <w:r>
+              <w:t xml:space="preserve"> on frequency or amplitude mode</w:t>
+            </w:r>
+          </w:p>
+          <w:p>
+            <w:pPr>
+              <w:rPr>
+                <w:b/>
+                <w:bCs/>
+                <w:color w:val="4472C4" w:themeColor="accent1"/>
+              </w:rPr>
+            </w:pPr>
+          </w:p>
+          <w:p>
+            <w:r>
+              <w:rPr>
+                <w:b/>
+                <w:bCs/>
+                <w:color w:val="4472C4" w:themeColor="accent1"/>
+              </w:rPr>
+              <w:br/>
+            </w:r>
+          </w:p>
+        </w:tc>
+      </w:tr>
+      <w:tr>
+        <w:tc>
+          <w:tcPr>
+            <w:tcW w:w="9330" w:type="dxa"/>
+            <w:gridSpan w:val="2"/>
+            <w:tcBorders>
+              <w:top w:val="single" w:sz="6" w:space="0" w:color="D0CECE" w:themeColor="background2" w:themeShade="E6"/>
+              <w:left w:val="single" w:sz="6" w:space="0" w:color="D0CECE" w:themeColor="background2" w:themeShade="E6"/>
+              <w:bottom w:val="single" w:sz="6" w:space="0" w:color="D0CECE" w:themeColor="background2" w:themeShade="E6"/>
+              <w:right w:val="single" w:sz="6" w:space="0" w:color="D0CECE" w:themeColor="background2" w:themeShade="E6"/>
+            </w:tcBorders>
+          </w:tcPr>
+          <w:p>
+            <w:pPr>
+              <w:rPr>
+                <w:rStyle w:val="Tryit"/>
+              </w:rPr>
+            </w:pPr>
+          </w:p>
         </w:tc>
       </w:tr>
     </w:tbl>
@@ -1331,6 +1713,92 @@
     </w:lvl>
   </w:abstractNum>
   <w:abstractNum w:abstractNumId="3" w15:restartNumberingAfterBreak="0">
+    <w:nsid w:val="20120D6D"/>
+    <w:multiLevelType w:val="hybridMultilevel"/>
+    <w:tmpl w:val="95AA448C"/>
+    <w:lvl w:ilvl="0" w:tplc="0409000F">
+      <w:start w:val="1"/>
+      <w:numFmt w:val="decimal"/>
+      <w:lvlText w:val="%1."/>
+      <w:lvlJc w:val="left"/>
+      <w:pPr>
+        <w:ind w:left="720" w:hanging="360"/>
+      </w:pPr>
+    </w:lvl>
+    <w:lvl w:ilvl="1" w:tplc="04090019">
+      <w:start w:val="1"/>
+      <w:numFmt w:val="lowerLetter"/>
+      <w:lvlText w:val="%2."/>
+      <w:lvlJc w:val="left"/>
+      <w:pPr>
+        <w:ind w:left="1440" w:hanging="360"/>
+      </w:pPr>
+    </w:lvl>
+    <w:lvl w:ilvl="2" w:tplc="0409001B" w:tentative="1">
+      <w:start w:val="1"/>
+      <w:numFmt w:val="lowerRoman"/>
+      <w:lvlText w:val="%3."/>
+      <w:lvlJc w:val="right"/>
+      <w:pPr>
+        <w:ind w:left="2160" w:hanging="180"/>
+      </w:pPr>
+    </w:lvl>
+    <w:lvl w:ilvl="3" w:tplc="0409000F" w:tentative="1">
+      <w:start w:val="1"/>
+      <w:numFmt w:val="decimal"/>
+      <w:lvlText w:val="%4."/>
+      <w:lvlJc w:val="left"/>
+      <w:pPr>
+        <w:ind w:left="2880" w:hanging="360"/>
+      </w:pPr>
+    </w:lvl>
+    <w:lvl w:ilvl="4" w:tplc="04090019" w:tentative="1">
+      <w:start w:val="1"/>
+      <w:numFmt w:val="lowerLetter"/>
+      <w:lvlText w:val="%5."/>
+      <w:lvlJc w:val="left"/>
+      <w:pPr>
+        <w:ind w:left="3600" w:hanging="360"/>
+      </w:pPr>
+    </w:lvl>
+    <w:lvl w:ilvl="5" w:tplc="0409001B" w:tentative="1">
+      <w:start w:val="1"/>
+      <w:numFmt w:val="lowerRoman"/>
+      <w:lvlText w:val="%6."/>
+      <w:lvlJc w:val="right"/>
+      <w:pPr>
+        <w:ind w:left="4320" w:hanging="180"/>
+      </w:pPr>
+    </w:lvl>
+    <w:lvl w:ilvl="6" w:tplc="0409000F" w:tentative="1">
+      <w:start w:val="1"/>
+      <w:numFmt w:val="decimal"/>
+      <w:lvlText w:val="%7."/>
+      <w:lvlJc w:val="left"/>
+      <w:pPr>
+        <w:ind w:left="5040" w:hanging="360"/>
+      </w:pPr>
+    </w:lvl>
+    <w:lvl w:ilvl="7" w:tplc="04090019" w:tentative="1">
+      <w:start w:val="1"/>
+      <w:numFmt w:val="lowerLetter"/>
+      <w:lvlText w:val="%8."/>
+      <w:lvlJc w:val="left"/>
+      <w:pPr>
+        <w:ind w:left="5760" w:hanging="360"/>
+      </w:pPr>
+    </w:lvl>
+    <w:lvl w:ilvl="8" w:tplc="0409001B" w:tentative="1">
+      <w:start w:val="1"/>
+      <w:numFmt w:val="lowerRoman"/>
+      <w:lvlText w:val="%9."/>
+      <w:lvlJc w:val="right"/>
+      <w:pPr>
+        <w:ind w:left="6480" w:hanging="180"/>
+      </w:pPr>
+    </w:lvl>
+  </w:abstractNum>
+  <w:abstractNum w:abstractNumId="4" w15:restartNumberingAfterBreak="0">
     <w:nsid w:val="27744865"/>
     <w:multiLevelType w:val="hybridMultilevel"/>
     <w:tmpl w:val="2BE666A0"/>
@@ -1443,7 +1911,7 @@
       </w:rPr>
     </w:lvl>
   </w:abstractNum>
-  <w:abstractNum w:abstractNumId="4" w15:restartNumberingAfterBreak="0">
+  <w:abstractNum w:abstractNumId="5" w15:restartNumberingAfterBreak="0">
     <w:nsid w:val="35B071D1"/>
     <w:multiLevelType w:val="hybridMultilevel"/>
     <w:tmpl w:val="4B30DC46"/>
@@ -1556,7 +2024,7 @@
       </w:rPr>
     </w:lvl>
   </w:abstractNum>
-  <w:abstractNum w:abstractNumId="5" w15:restartNumberingAfterBreak="0">
+  <w:abstractNum w:abstractNumId="6" w15:restartNumberingAfterBreak="0">
     <w:nsid w:val="35F54778"/>
     <w:multiLevelType w:val="hybridMultilevel"/>
     <w:tmpl w:val="160C07D4"/>
@@ -1642,7 +2110,7 @@
       </w:pPr>
     </w:lvl>
   </w:abstractNum>
-  <w:abstractNum w:abstractNumId="6" w15:restartNumberingAfterBreak="0">
+  <w:abstractNum w:abstractNumId="7" w15:restartNumberingAfterBreak="0">
     <w:nsid w:val="3D6F7B14"/>
     <w:multiLevelType w:val="hybridMultilevel"/>
     <w:tmpl w:val="1F3A5DF2"/>
@@ -1755,7 +2223,233 @@
       </w:rPr>
     </w:lvl>
   </w:abstractNum>
-  <w:abstractNum w:abstractNumId="7" w15:restartNumberingAfterBreak="0">
+  <w:abstractNum w:abstractNumId="8" w15:restartNumberingAfterBreak="0">
+    <w:nsid w:val="45BA3BC7"/>
+    <w:multiLevelType w:val="hybridMultilevel"/>
+    <w:tmpl w:val="1C1CE548"/>
+    <w:lvl w:ilvl="0" w:tplc="04090001">
+      <w:start w:val="1"/>
+      <w:numFmt w:val="bullet"/>
+      <w:lvlText w:val=""/>
+      <w:lvlJc w:val="left"/>
+      <w:pPr>
+        <w:ind w:left="720" w:hanging="360"/>
+      </w:pPr>
+      <w:rPr>
+        <w:rFonts w:ascii="Symbol" w:hAnsi="Symbol" w:hint="default"/>
+      </w:rPr>
+    </w:lvl>
+    <w:lvl w:ilvl="1" w:tplc="04090003" w:tentative="1">
+      <w:start w:val="1"/>
+      <w:numFmt w:val="bullet"/>
+      <w:lvlText w:val="o"/>
+      <w:lvlJc w:val="left"/>
+      <w:pPr>
+        <w:ind w:left="1440" w:hanging="360"/>
+      </w:pPr>
+      <w:rPr>
+        <w:rFonts w:ascii="Courier New" w:hAnsi="Courier New" w:cs="Courier New" w:hint="default"/>
+      </w:rPr>
+    </w:lvl>
+    <w:lvl w:ilvl="2" w:tplc="04090005" w:tentative="1">
+      <w:start w:val="1"/>
+      <w:numFmt w:val="bullet"/>
+      <w:lvlText w:val=""/>
+      <w:lvlJc w:val="left"/>
+      <w:pPr>
+        <w:ind w:left="2160" w:hanging="360"/>
+      </w:pPr>
+      <w:rPr>
+        <w:rFonts w:ascii="Wingdings" w:hAnsi="Wingdings" w:hint="default"/>
+      </w:rPr>
+    </w:lvl>
+    <w:lvl w:ilvl="3" w:tplc="04090001" w:tentative="1">
+      <w:start w:val="1"/>
+      <w:numFmt w:val="bullet"/>
+      <w:lvlText w:val=""/>
+      <w:lvlJc w:val="left"/>
+      <w:pPr>
+        <w:ind w:left="2880" w:hanging="360"/>
+      </w:pPr>
+      <w:rPr>
+        <w:rFonts w:ascii="Symbol" w:hAnsi="Symbol" w:hint="default"/>
+      </w:rPr>
+    </w:lvl>
+    <w:lvl w:ilvl="4" w:tplc="04090003" w:tentative="1">
+      <w:start w:val="1"/>
+      <w:numFmt w:val="bullet"/>
+      <w:lvlText w:val="o"/>
+      <w:lvlJc w:val="left"/>
+      <w:pPr>
+        <w:ind w:left="3600" w:hanging="360"/>
+      </w:pPr>
+      <w:rPr>
+        <w:rFonts w:ascii="Courier New" w:hAnsi="Courier New" w:cs="Courier New" w:hint="default"/>
+      </w:rPr>
+    </w:lvl>
+    <w:lvl w:ilvl="5" w:tplc="04090005" w:tentative="1">
+      <w:start w:val="1"/>
+      <w:numFmt w:val="bullet"/>
+      <w:lvlText w:val=""/>
+      <w:lvlJc w:val="left"/>
+      <w:pPr>
+        <w:ind w:left="4320" w:hanging="360"/>
+      </w:pPr>
+      <w:rPr>
+        <w:rFonts w:ascii="Wingdings" w:hAnsi="Wingdings" w:hint="default"/>
+      </w:rPr>
+    </w:lvl>
+    <w:lvl w:ilvl="6" w:tplc="04090001" w:tentative="1">
+      <w:start w:val="1"/>
+      <w:numFmt w:val="bullet"/>
+      <w:lvlText w:val=""/>
+      <w:lvlJc w:val="left"/>
+      <w:pPr>
+        <w:ind w:left="5040" w:hanging="360"/>
+      </w:pPr>
+      <w:rPr>
+        <w:rFonts w:ascii="Symbol" w:hAnsi="Symbol" w:hint="default"/>
+      </w:rPr>
+    </w:lvl>
+    <w:lvl w:ilvl="7" w:tplc="04090003" w:tentative="1">
+      <w:start w:val="1"/>
+      <w:numFmt w:val="bullet"/>
+      <w:lvlText w:val="o"/>
+      <w:lvlJc w:val="left"/>
+      <w:pPr>
+        <w:ind w:left="5760" w:hanging="360"/>
+      </w:pPr>
+      <w:rPr>
+        <w:rFonts w:ascii="Courier New" w:hAnsi="Courier New" w:cs="Courier New" w:hint="default"/>
+      </w:rPr>
+    </w:lvl>
+    <w:lvl w:ilvl="8" w:tplc="04090005" w:tentative="1">
+      <w:start w:val="1"/>
+      <w:numFmt w:val="bullet"/>
+      <w:lvlText w:val=""/>
+      <w:lvlJc w:val="left"/>
+      <w:pPr>
+        <w:ind w:left="6480" w:hanging="360"/>
+      </w:pPr>
+      <w:rPr>
+        <w:rFonts w:ascii="Wingdings" w:hAnsi="Wingdings" w:hint="default"/>
+      </w:rPr>
+    </w:lvl>
+  </w:abstractNum>
+  <w:abstractNum w:abstractNumId="9" w15:restartNumberingAfterBreak="0">
+    <w:nsid w:val="55211EEE"/>
+    <w:multiLevelType w:val="hybridMultilevel"/>
+    <w:tmpl w:val="A1DCEDE8"/>
+    <w:lvl w:ilvl="0" w:tplc="04090001">
+      <w:start w:val="1"/>
+      <w:numFmt w:val="bullet"/>
+      <w:lvlText w:val=""/>
+      <w:lvlJc w:val="left"/>
+      <w:pPr>
+        <w:ind w:left="720" w:hanging="360"/>
+      </w:pPr>
+      <w:rPr>
+        <w:rFonts w:ascii="Symbol" w:hAnsi="Symbol" w:hint="default"/>
+      </w:rPr>
+    </w:lvl>
+    <w:lvl w:ilvl="1" w:tplc="04090003" w:tentative="1">
+      <w:start w:val="1"/>
+      <w:numFmt w:val="bullet"/>
+      <w:lvlText w:val="o"/>
+      <w:lvlJc w:val="left"/>
+      <w:pPr>
+        <w:ind w:left="1440" w:hanging="360"/>
+      </w:pPr>
+      <w:rPr>
+        <w:rFonts w:ascii="Courier New" w:hAnsi="Courier New" w:cs="Courier New" w:hint="default"/>
+      </w:rPr>
+    </w:lvl>
+    <w:lvl w:ilvl="2" w:tplc="04090005" w:tentative="1">
+      <w:start w:val="1"/>
+      <w:numFmt w:val="bullet"/>
+      <w:lvlText w:val=""/>
+      <w:lvlJc w:val="left"/>
+      <w:pPr>
+        <w:ind w:left="2160" w:hanging="360"/>
+      </w:pPr>
+      <w:rPr>
+        <w:rFonts w:ascii="Wingdings" w:hAnsi="Wingdings" w:hint="default"/>
+      </w:rPr>
+    </w:lvl>
+    <w:lvl w:ilvl="3" w:tplc="04090001" w:tentative="1">
+      <w:start w:val="1"/>
+      <w:numFmt w:val="bullet"/>
+      <w:lvlText w:val=""/>
+      <w:lvlJc w:val="left"/>
+      <w:pPr>
+        <w:ind w:left="2880" w:hanging="360"/>
+      </w:pPr>
+      <w:rPr>
+        <w:rFonts w:ascii="Symbol" w:hAnsi="Symbol" w:hint="default"/>
+      </w:rPr>
+    </w:lvl>
+    <w:lvl w:ilvl="4" w:tplc="04090003" w:tentative="1">
+      <w:start w:val="1"/>
+      <w:numFmt w:val="bullet"/>
+      <w:lvlText w:val="o"/>
+      <w:lvlJc w:val="left"/>
+      <w:pPr>
+        <w:ind w:left="3600" w:hanging="360"/>
+      </w:pPr>
+      <w:rPr>
+        <w:rFonts w:ascii="Courier New" w:hAnsi="Courier New" w:cs="Courier New" w:hint="default"/>
+      </w:rPr>
+    </w:lvl>
+    <w:lvl w:ilvl="5" w:tplc="04090005" w:tentative="1">
+      <w:start w:val="1"/>
+      <w:numFmt w:val="bullet"/>
+      <w:lvlText w:val=""/>
+      <w:lvlJc w:val="left"/>
+      <w:pPr>
+        <w:ind w:left="4320" w:hanging="360"/>
+      </w:pPr>
+      <w:rPr>
+        <w:rFonts w:ascii="Wingdings" w:hAnsi="Wingdings" w:hint="default"/>
+      </w:rPr>
+    </w:lvl>
+    <w:lvl w:ilvl="6" w:tplc="04090001" w:tentative="1">
+      <w:start w:val="1"/>
+      <w:numFmt w:val="bullet"/>
+      <w:lvlText w:val=""/>
+      <w:lvlJc w:val="left"/>
+      <w:pPr>
+        <w:ind w:left="5040" w:hanging="360"/>
+      </w:pPr>
+      <w:rPr>
+        <w:rFonts w:ascii="Symbol" w:hAnsi="Symbol" w:hint="default"/>
+      </w:rPr>
+    </w:lvl>
+    <w:lvl w:ilvl="7" w:tplc="04090003" w:tentative="1">
+      <w:start w:val="1"/>
+      <w:numFmt w:val="bullet"/>
+      <w:lvlText w:val="o"/>
+      <w:lvlJc w:val="left"/>
+      <w:pPr>
+        <w:ind w:left="5760" w:hanging="360"/>
+      </w:pPr>
+      <w:rPr>
+        <w:rFonts w:ascii="Courier New" w:hAnsi="Courier New" w:cs="Courier New" w:hint="default"/>
+      </w:rPr>
+    </w:lvl>
+    <w:lvl w:ilvl="8" w:tplc="04090005" w:tentative="1">
+      <w:start w:val="1"/>
+      <w:numFmt w:val="bullet"/>
+      <w:lvlText w:val=""/>
+      <w:lvlJc w:val="left"/>
+      <w:pPr>
+        <w:ind w:left="6480" w:hanging="360"/>
+      </w:pPr>
+      <w:rPr>
+        <w:rFonts w:ascii="Wingdings" w:hAnsi="Wingdings" w:hint="default"/>
+      </w:rPr>
+    </w:lvl>
+  </w:abstractNum>
+  <w:abstractNum w:abstractNumId="10" w15:restartNumberingAfterBreak="0">
     <w:nsid w:val="58CA7EF6"/>
     <w:multiLevelType w:val="hybridMultilevel"/>
     <w:tmpl w:val="FFFFFFFF"/>
@@ -1841,7 +2535,7 @@
       </w:pPr>
     </w:lvl>
   </w:abstractNum>
-  <w:abstractNum w:abstractNumId="8" w15:restartNumberingAfterBreak="0">
+  <w:abstractNum w:abstractNumId="11" w15:restartNumberingAfterBreak="0">
     <w:nsid w:val="5B5F1F9B"/>
     <w:multiLevelType w:val="hybridMultilevel"/>
     <w:tmpl w:val="FFFFFFFF"/>
@@ -1927,7 +2621,120 @@
       </w:pPr>
     </w:lvl>
   </w:abstractNum>
-  <w:abstractNum w:abstractNumId="9" w15:restartNumberingAfterBreak="0">
+  <w:abstractNum w:abstractNumId="12" w15:restartNumberingAfterBreak="0">
+    <w:nsid w:val="5D083E91"/>
+    <w:multiLevelType w:val="hybridMultilevel"/>
+    <w:tmpl w:val="EAC2C68E"/>
+    <w:lvl w:ilvl="0" w:tplc="04090001">
+      <w:start w:val="1"/>
+      <w:numFmt w:val="bullet"/>
+      <w:lvlText w:val=""/>
+      <w:lvlJc w:val="left"/>
+      <w:pPr>
+        <w:ind w:left="720" w:hanging="360"/>
+      </w:pPr>
+      <w:rPr>
+        <w:rFonts w:ascii="Symbol" w:hAnsi="Symbol" w:hint="default"/>
+      </w:rPr>
+    </w:lvl>
+    <w:lvl w:ilvl="1" w:tplc="04090003" w:tentative="1">
+      <w:start w:val="1"/>
+      <w:numFmt w:val="bullet"/>
+      <w:lvlText w:val="o"/>
+      <w:lvlJc w:val="left"/>
+      <w:pPr>
+        <w:ind w:left="1440" w:hanging="360"/>
+      </w:pPr>
+      <w:rPr>
+        <w:rFonts w:ascii="Courier New" w:hAnsi="Courier New" w:cs="Courier New" w:hint="default"/>
+      </w:rPr>
+    </w:lvl>
+    <w:lvl w:ilvl="2" w:tplc="04090005" w:tentative="1">
+      <w:start w:val="1"/>
+      <w:numFmt w:val="bullet"/>
+      <w:lvlText w:val=""/>
+      <w:lvlJc w:val="left"/>
+      <w:pPr>
+        <w:ind w:left="2160" w:hanging="360"/>
+      </w:pPr>
+      <w:rPr>
+        <w:rFonts w:ascii="Wingdings" w:hAnsi="Wingdings" w:hint="default"/>
+      </w:rPr>
+    </w:lvl>
+    <w:lvl w:ilvl="3" w:tplc="04090001" w:tentative="1">
+      <w:start w:val="1"/>
+      <w:numFmt w:val="bullet"/>
+      <w:lvlText w:val=""/>
+      <w:lvlJc w:val="left"/>
+      <w:pPr>
+        <w:ind w:left="2880" w:hanging="360"/>
+      </w:pPr>
+      <w:rPr>
+        <w:rFonts w:ascii="Symbol" w:hAnsi="Symbol" w:hint="default"/>
+      </w:rPr>
+    </w:lvl>
+    <w:lvl w:ilvl="4" w:tplc="04090003" w:tentative="1">
+      <w:start w:val="1"/>
+      <w:numFmt w:val="bullet"/>
+      <w:lvlText w:val="o"/>
+      <w:lvlJc w:val="left"/>
+      <w:pPr>
+        <w:ind w:left="3600" w:hanging="360"/>
+      </w:pPr>
+      <w:rPr>
+        <w:rFonts w:ascii="Courier New" w:hAnsi="Courier New" w:cs="Courier New" w:hint="default"/>
+      </w:rPr>
+    </w:lvl>
+    <w:lvl w:ilvl="5" w:tplc="04090005" w:tentative="1">
+      <w:start w:val="1"/>
+      <w:numFmt w:val="bullet"/>
+      <w:lvlText w:val=""/>
+      <w:lvlJc w:val="left"/>
+      <w:pPr>
+        <w:ind w:left="4320" w:hanging="360"/>
+      </w:pPr>
+      <w:rPr>
+        <w:rFonts w:ascii="Wingdings" w:hAnsi="Wingdings" w:hint="default"/>
+      </w:rPr>
+    </w:lvl>
+    <w:lvl w:ilvl="6" w:tplc="04090001" w:tentative="1">
+      <w:start w:val="1"/>
+      <w:numFmt w:val="bullet"/>
+      <w:lvlText w:val=""/>
+      <w:lvlJc w:val="left"/>
+      <w:pPr>
+        <w:ind w:left="5040" w:hanging="360"/>
+      </w:pPr>
+      <w:rPr>
+        <w:rFonts w:ascii="Symbol" w:hAnsi="Symbol" w:hint="default"/>
+      </w:rPr>
+    </w:lvl>
+    <w:lvl w:ilvl="7" w:tplc="04090003" w:tentative="1">
+      <w:start w:val="1"/>
+      <w:numFmt w:val="bullet"/>
+      <w:lvlText w:val="o"/>
+      <w:lvlJc w:val="left"/>
+      <w:pPr>
+        <w:ind w:left="5760" w:hanging="360"/>
+      </w:pPr>
+      <w:rPr>
+        <w:rFonts w:ascii="Courier New" w:hAnsi="Courier New" w:cs="Courier New" w:hint="default"/>
+      </w:rPr>
+    </w:lvl>
+    <w:lvl w:ilvl="8" w:tplc="04090005" w:tentative="1">
+      <w:start w:val="1"/>
+      <w:numFmt w:val="bullet"/>
+      <w:lvlText w:val=""/>
+      <w:lvlJc w:val="left"/>
+      <w:pPr>
+        <w:ind w:left="6480" w:hanging="360"/>
+      </w:pPr>
+      <w:rPr>
+        <w:rFonts w:ascii="Wingdings" w:hAnsi="Wingdings" w:hint="default"/>
+      </w:rPr>
+    </w:lvl>
+  </w:abstractNum>
+  <w:abstractNum w:abstractNumId="13" w15:restartNumberingAfterBreak="0">
     <w:nsid w:val="6DE25284"/>
     <w:multiLevelType w:val="hybridMultilevel"/>
     <w:tmpl w:val="9F52827E"/>
@@ -2041,25 +2848,25 @@
     </w:lvl>
   </w:abstractNum>
   <w:num w:numId="1" w16cid:durableId="1619069917">
-    <w:abstractNumId w:val="6"/>
+    <w:abstractNumId w:val="7"/>
   </w:num>
   <w:num w:numId="2" w16cid:durableId="641160648">
-    <w:abstractNumId w:val="9"/>
+    <w:abstractNumId w:val="13"/>
   </w:num>
   <w:num w:numId="3" w16cid:durableId="220482957">
-    <w:abstractNumId w:val="4"/>
+    <w:abstractNumId w:val="5"/>
   </w:num>
   <w:num w:numId="4" w16cid:durableId="925000632">
-    <w:abstractNumId w:val="8"/>
+    <w:abstractNumId w:val="11"/>
   </w:num>
   <w:num w:numId="5" w16cid:durableId="1865898672">
-    <w:abstractNumId w:val="7"/>
+    <w:abstractNumId w:val="10"/>
   </w:num>
   <w:num w:numId="6" w16cid:durableId="852303940">
     <w:abstractNumId w:val="0"/>
   </w:num>
   <w:num w:numId="7" w16cid:durableId="706371149">
-    <w:abstractNumId w:val="5"/>
+    <w:abstractNumId w:val="6"/>
   </w:num>
   <w:num w:numId="8" w16cid:durableId="954219210">
     <w:abstractNumId w:val="1"/>
@@ -2068,6 +2875,18 @@
     <w:abstractNumId w:val="2"/>
   </w:num>
   <w:num w:numId="10" w16cid:durableId="1032612548">
+    <w:abstractNumId w:val="4"/>
+  </w:num>
+  <w:num w:numId="11" w16cid:durableId="731273960">
+    <w:abstractNumId w:val="8"/>
+  </w:num>
+  <w:num w:numId="12" w16cid:durableId="1702854452">
+    <w:abstractNumId w:val="9"/>
+  </w:num>
+  <w:num w:numId="13" w16cid:durableId="566501733">
+    <w:abstractNumId w:val="12"/>
+  </w:num>
+  <w:num w:numId="14" w16cid:durableId="1478841930">
     <w:abstractNumId w:val="3"/>
   </w:num>
 </w:numbering>
@@ -2521,6 +3340,27 @@
       <w:szCs w:val="26"/>
     </w:rPr>
   </w:style>
+  <w:style w:type="paragraph" w:styleId="Heading3">
+    <w:name w:val="heading 3"/>
+    <w:basedOn w:val="Normal"/>
+    <w:next w:val="Normal"/>
+    <w:link w:val="Heading3Char"/>
+    <w:uiPriority w:val="9"/>
+    <w:semiHidden/>
+    <w:qFormat/>
+    <w:rsid w:val="00081551"/>
+    <w:pPr>
+      <w:keepNext/>
+      <w:keepLines/>
+      <w:spacing w:before="40"/>
+      <w:outlineLvl w:val="2"/>
+    </w:pPr>
+    <w:rPr>
+      <w:rFonts w:asciiTheme="majorHAnsi" w:eastAsiaTheme="majorEastAsia" w:hAnsiTheme="majorHAnsi" w:cstheme="majorBidi"/>
+      <w:color w:val="1F3763" w:themeColor="accent1" w:themeShade="7F"/>
+      <w:szCs w:val="24"/>
+    </w:rPr>
+  </w:style>
   <w:style w:type="character" w:default="1" w:styleId="DefaultParagraphFont">
     <w:name w:val="Default Paragraph Font"/>
     <w:uiPriority w:val="1"/>
@@ -2833,7 +3673,6 @@
     <w:name w:val="List Paragraph"/>
     <w:basedOn w:val="Normal"/>
     <w:uiPriority w:val="34"/>
-    <w:semiHidden/>
     <w:qFormat/>
     <w:rsid w:val="00065EF7"/>
     <w:pPr>
@@ -3006,6 +3845,20 @@
       <w:i/>
       <w:iCs/>
       <w:lang w:val="fr-FR"/>
+    </w:rPr>
+  </w:style>
+  <w:style w:type="character" w:customStyle="1" w:styleId="Heading3Char">
+    <w:name w:val="Heading 3 Char"/>
+    <w:basedOn w:val="DefaultParagraphFont"/>
+    <w:link w:val="Heading3"/>
+    <w:uiPriority w:val="9"/>
+    <w:semiHidden/>
+    <w:rsid w:val="00081551"/>
+    <w:rPr>
+      <w:rFonts w:asciiTheme="majorHAnsi" w:eastAsiaTheme="majorEastAsia" w:hAnsiTheme="majorHAnsi" w:cstheme="majorBidi"/>
+      <w:color w:val="1F3763" w:themeColor="accent1" w:themeShade="7F"/>
+      <w:sz w:val="24"/>
+      <w:szCs w:val="24"/>
     </w:rPr>
   </w:style>
 </w:styles>

</xml_diff>